<commit_message>
Add reproducibility detail and edmm profile attribution to LBD draft
Method section: name the FMA-small split and exact track count (7,994 of
8,000), the classifier's 5-fold stratified CV, and the exact 144-dim
feature breakdown (12-bin chroma mean + 128-band mel-spectrogram mean +
tempo + spectral centroid/bandwidth/rolloff), all verified against
features.py and train_genre_classifier.py rather than assumed.

Results section: note that exact root+mode match gives no partial credit
for relative/fifth-related key errors, the strictest common MIR standard.

References: add Faraldo et al. (ECIR 2016), who formalized the edmm/edma
EDM key profiles that Essentia implements, alongside the existing
Essentia software citation.
</commit_message>
<xml_diff>
--- a/docs/ISMIR2026_LBD_draft.docx
+++ b/docs/ISMIR2026_LBD_draft.docx
@@ -770,7 +770,7 @@
         <w:pStyle w:val="BodyText"/>
       </w:pPr>
       <w:r>
-        <w:t xml:space="preserve">Key detection correlates a track’s mean 12-bin chroma vector (CQT, librosa [2]) against 24 rotated major/minor profile pairs and returns the best-correlating root and mode. We compare two profile sources: the K-S profile [1], and Essentia’s corpus-derived edmm profile [3], built from real EDM audio with a deliberately flat major-mode template reflecting how rare major keys are in electronic music. A binary genre classifier (logistic regression, scikit-learn [4], standardized features, balanced class weights) is trained exclusively on FMA [5] tracks labeled electronic / non-electronic via FMA’s own top-level genre metadata, using the same 144-dimensional descriptor (chroma, mel-spectrogram summary, tempo, spectral centroid/bandwidth/rolloff) already computed for retrieval. At inference, each track is routed to the EDM-tuned profile if predicted electronic, otherwise to the K-S profile.</w:t>
+        <w:t xml:space="preserve">Key detection correlates a track’s mean 12-bin chroma vector (CQT, librosa [2]) against 24 rotated major/minor profile pairs and returns the best-correlating root and mode. We compare two profile sources: the K-S profile [1], and a corpus-derived EDM key profile (Essentia’s edmm implementation [3], formalized by Faraldo et al. [7]), built from real EDM audio with a deliberately flat major-mode template reflecting how rare major keys are in electronic music. A binary genre classifier (logistic regression, scikit-learn [4], standardized features, balanced class weights) is trained, with 5-fold stratified cross-validation, exclusively on the 7,994 (of 8,000) FMA-small [5] tracks labeled electronic / non-electronic via FMA’s own top-level genre metadata, using the same 144-dimensional descriptor (12-bin chroma mean, 128-band mel-spectrogram mean, tempo, and spectral centroid/bandwidth/rolloff) already computed for retrieval. At inference, each track is routed to the EDM-tuned profile if predicted electronic, otherwise to the K-S profile.</w:t>
       </w:r>
     </w:p>
     <w:p>
@@ -794,7 +794,7 @@
         <w:pStyle w:val="BodyText"/>
       </w:pPr>
       <w:r>
-        <w:t xml:space="preserve">Table 1 reports exact key-match accuracy (root and mode) under four routing strategies. Genre-conditioned routing lifts GiantSteps accuracy from 44.5% to 52.6% — 87% of the 9.3-point oracle ceiling — while leaving Bach’s accuracy at 79.2%, identical to oracle routing; the classifier correctly identified genre for effectively all Bach tracks. On GiantSteps specifically, our unmodified K-S baseline (44.5%) already exceeds two baselines reported in the dataset’s own paper [6], QM-Key (39.4%) and Essentia’s default extractor (30.5%), and the routed system (52.6%) further surpasses KeyFinder (45.4%), though a gap remains to the closed commercial tools Mixed-In-Key (67.2%) and Rekordbox (71.9%).</w:t>
+        <w:t xml:space="preserve">Table 1 reports exact key-match accuracy (root and mode) under four routing strategies — the strictest common MIR evaluation standard, giving no partial credit for closely related (e.g., relative- or fifth-related) key errors. Genre-conditioned routing lifts GiantSteps accuracy from 44.5% to 52.6% — 87% of the 9.3-point oracle ceiling — while leaving Bach’s accuracy at 79.2%, identical to oracle routing; the classifier correctly identified genre for effectively all Bach tracks. On GiantSteps specifically, our unmodified K-S baseline (44.5%) already exceeds two baselines reported in the dataset’s own paper [6], QM-Key (39.4%) and Essentia’s default extractor (30.5%), and the routed system (52.6%) further surpasses KeyFinder (45.4%), though a gap remains to the closed commercial tools Mixed-In-Key (67.2%) and Rekordbox (71.9%).</w:t>
       </w:r>
     </w:p>
     <w:p>
@@ -1275,6 +1275,29 @@
       </w:r>
       <w:r>
         <w:t xml:space="preserve">, 2015, pp. 364–370.</w:t>
+      </w:r>
+    </w:p>
+    <w:p>
+      <w:pPr>
+        <w:pStyle w:val="BodyText"/>
+        <w:numPr>
+          <w:ilvl w:val="0"/>
+          <w:numId w:val="19"/>
+        </w:numPr>
+        <w:spacing w:after="120"/>
+        <w:ind w:left="425" w:hanging="425"/>
+      </w:pPr>
+      <w:r>
+        <w:t xml:space="preserve">Á. Faraldo, E. Gómez, S. Jordà, and P. Herrera, “Key estimation in electronic dance music,” in </w:t>
+      </w:r>
+      <w:r>
+        <w:rPr>
+          <w:i/>
+        </w:rPr>
+        <w:t xml:space="preserve">Proc. of the 38th European Conf. on Information Retrieval</w:t>
+      </w:r>
+      <w:r>
+        <w:t xml:space="preserve">, 2016, pp. 335–347.</w:t>
       </w:r>
     </w:p>
     <w:sectPr>

</xml_diff>

<commit_message>
Remove dangling retrieval references from the standalone LBD draft
This paper never introduces a retrieval/search system, so "already
computed for retrieval" (Method) and "retrieval-quality evaluation"
(Conclusion) were undefined references that would read as leftovers from
a different paper. Method now just states the descriptor plainly; the
Conclusion's future-work item is replaced with validating the routing
approach on less-curated real-world catalogs, which stays in scope for a
key-estimation paper.
</commit_message>
<xml_diff>
--- a/docs/ISMIR2026_LBD_draft.docx
+++ b/docs/ISMIR2026_LBD_draft.docx
@@ -770,7 +770,7 @@
         <w:pStyle w:val="BodyText"/>
       </w:pPr>
       <w:r>
-        <w:t xml:space="preserve">Key detection correlates a track’s mean 12-bin chroma vector (CQT, librosa [2]) against 24 rotated major/minor profile pairs and returns the best-correlating root and mode. We compare two profile sources: the K-S profile [1], and a corpus-derived EDM key profile (Essentia’s edmm implementation [3], formalized by Faraldo et al. [7]), built from real EDM audio with a deliberately flat major-mode template reflecting how rare major keys are in electronic music. A binary genre classifier (logistic regression, scikit-learn [4], standardized features, balanced class weights) is trained, with 5-fold stratified cross-validation, exclusively on the 7,994 (of 8,000) FMA-small [5] tracks labeled electronic / non-electronic via FMA’s own top-level genre metadata, using the same 144-dimensional descriptor (12-bin chroma mean, 128-band mel-spectrogram mean, tempo, and spectral centroid/bandwidth/rolloff) already computed for retrieval. At inference, each track is routed to the EDM-tuned profile if predicted electronic, otherwise to the K-S profile.</w:t>
+        <w:t xml:space="preserve">Key detection correlates a track’s mean 12-bin chroma vector (CQT, librosa [2]) against 24 rotated major/minor profile pairs and returns the best-correlating root and mode. We compare two profile sources: the K-S profile [1], and a corpus-derived EDM key profile (Essentia’s edmm implementation [3], formalized by Faraldo et al. [7]), built from real EDM audio with a deliberately flat major-mode template reflecting how rare major keys are in electronic music. A binary genre classifier (logistic regression, scikit-learn [4], standardized features, balanced class weights) is trained, with 5-fold stratified cross-validation, exclusively on the 7,994 (of 8,000) FMA-small [5] tracks labeled electronic / non-electronic via FMA’s own top-level genre metadata, using a 144-dimensional descriptor (12-bin chroma mean, 128-band mel-spectrogram mean, tempo, and spectral centroid/bandwidth/rolloff). At inference, each track is routed to the EDM-tuned profile if predicted electronic, otherwise to the K-S profile.</w:t>
       </w:r>
     </w:p>
     <w:p>
@@ -1112,7 +1112,7 @@
         <w:pStyle w:val="BodyText"/>
       </w:pPr>
       <w:r>
-        <w:t xml:space="preserve">Genre-conditioned key-profile routing is a cheap, reproducible way to correct a real, measurable genre bias in a standard key-detection approach: one lightweight classifier, no changes to the underlying detector, and validated with strict train/held-out corpus separation across three real datasets. The immediate use case is auto-tagging key metadata for untagged, mixed-genre catalogs that lack access to closed commercial tools. The genre split here is binary (electronic / non-electronic); extending it to a broader genre taxonomy as more labeled real data becomes available is the natural next step, along with integrating this routing into full retrieval-quality evaluation on real audio rather than key accuracy alone.</w:t>
+        <w:t xml:space="preserve">Genre-conditioned key-profile routing is a cheap, reproducible way to correct a real, measurable genre bias in a standard key-detection approach: one lightweight classifier, no changes to the underlying detector, and validated with strict train/held-out corpus separation across three real datasets. The immediate use case is auto-tagging key metadata for untagged, mixed-genre catalogs that lack access to closed commercial tools. The genre split here is binary (electronic / non-electronic); extending it to a broader genre taxonomy as more labeled real data becomes available is the natural next step, along with validating the routing approach on less-curated, real-world catalogs beyond the two benchmark corpora used here.</w:t>
       </w:r>
     </w:p>
     <w:p>

</xml_diff>

<commit_message>
Clarify the 87% figure's meaning in the LBD draft
"Capturing 87% of the oracle ceiling of 53.8%" reads as 52.6/53.8
(97.8%), not the intended gap-closure metric (52.6-44.5)/(53.8-44.5).
A reader hit exactly this confusion. Reworded in both Abstract and
Results to "closing 87% of the gap between the baseline and the oracle
ceiling," which states the actual computation instead of leaving it
ambiguous.
</commit_message>
<xml_diff>
--- a/docs/ISMIR2026_LBD_draft.docx
+++ b/docs/ISMIR2026_LBD_draft.docx
@@ -339,7 +339,7 @@
         <w:pStyle w:val="BodyText"/>
       </w:pPr>
       <w:r>
-        <w:t xml:space="preserve">Automatic key detection typically applies a single fixed key-profile template, most often the Krumhansl-Schmuckler (K-S) profile derived from listener studies on tonal, mostly classical music, uniformly across all genres. We show this assumption is measurably wrong: the same K-S profile that reaches 79.2% exact-match accuracy on J.S. Bach’s Well-Tempered Clavier (Book 1, 48 tracks) drops to 44.5% on GiantSteps, a benchmark of 604 real, human-verified electronic dance tracks — a 35-point gap driven by genre, not audio quality. We introduce a lightweight, genre-conditioned routing system: a logistic-regression electronic/non-electronic classifier, trained and cross-validated only on the Free Music Archive (FMA) using its own genre metadata, selects between genre-matched key profiles at inference time. Evaluated end-to-end on two corpora held out entirely from training, the routed system lifts GiantSteps accuracy to 52.6% — capturing 87% of the oracle (perfect-routing) ceiling of 53.8% — while leaving Bach’s accuracy unchanged at 79.2%, matching its own oracle exactly. Even our unmodified fixed-profile baseline already exceeds two published academic baselines on GiantSteps. We position this as a practical building block for key-tagging untagged, mixed-genre catalogs — bedroom-producer archives and sample libraries — where genre-specific commercial tools are unavailable or closed.</w:t>
+        <w:t xml:space="preserve">Automatic key detection typically applies a single fixed key-profile template, most often the Krumhansl-Schmuckler (K-S) profile derived from listener studies on tonal, mostly classical music, uniformly across all genres. We show this assumption is measurably wrong: the same K-S profile that reaches 79.2% exact-match accuracy on J.S. Bach’s Well-Tempered Clavier (Book 1, 48 tracks) drops to 44.5% on GiantSteps, a benchmark of 604 real, human-verified electronic dance tracks — a 35-point gap driven by genre, not audio quality. We introduce a lightweight, genre-conditioned routing system: a logistic-regression electronic/non-electronic classifier, trained and cross-validated only on the Free Music Archive (FMA) using its own genre metadata, selects between genre-matched key profiles at inference time. Evaluated end-to-end on two corpora held out entirely from training, the routed system lifts GiantSteps accuracy to 52.6%, closing 87% of the gap between the fixed-profile baseline and the oracle (perfect-routing) ceiling of 53.8% — while leaving Bach’s accuracy unchanged at 79.2%, matching its own oracle exactly. Even our unmodified fixed-profile baseline already exceeds two published academic baselines on GiantSteps. We position this as a practical building block for key-tagging untagged, mixed-genre catalogs — bedroom-producer archives and sample libraries — where genre-specific commercial tools are unavailable or closed.</w:t>
       </w:r>
     </w:p>
     <w:p>
@@ -794,7 +794,7 @@
         <w:pStyle w:val="BodyText"/>
       </w:pPr>
       <w:r>
-        <w:t xml:space="preserve">Table 1 reports exact key-match accuracy (root and mode) under four routing strategies — the strictest common MIR evaluation standard, giving no partial credit for closely related (e.g., relative- or fifth-related) key errors. Genre-conditioned routing lifts GiantSteps accuracy from 44.5% to 52.6% — 87% of the 9.3-point oracle ceiling — while leaving Bach’s accuracy at 79.2%, identical to oracle routing; the classifier correctly identified genre for effectively all Bach tracks. On GiantSteps specifically, our unmodified K-S baseline (44.5%) already exceeds two baselines reported in the dataset’s own paper [6], QM-Key (39.4%) and Essentia’s default extractor (30.5%), and the routed system (52.6%) further surpasses KeyFinder (45.4%), though a gap remains to the closed commercial tools Mixed-In-Key (67.2%) and Rekordbox (71.9%).</w:t>
+        <w:t xml:space="preserve">Table 1 reports exact key-match accuracy (root and mode) under four routing strategies — the strictest common MIR evaluation standard, giving no partial credit for closely related (e.g., relative- or fifth-related) key errors. Genre-conditioned routing lifts GiantSteps accuracy from 44.5% to 52.6%, closing 87% of the 9.3-point gap to the oracle (perfect-routing) ceiling of 53.8% — while leaving Bach’s accuracy at 79.2%, identical to oracle routing; the classifier correctly identified genre for effectively all Bach tracks. On GiantSteps specifically, our unmodified K-S baseline (44.5%) already exceeds two baselines reported in the dataset’s own paper [6], QM-Key (39.4%) and Essentia’s default extractor (30.5%), and the routed system (52.6%) further surpasses KeyFinder (45.4%), though a gap remains to the closed commercial tools Mixed-In-Key (67.2%) and Rekordbox (71.9%).</w:t>
       </w:r>
     </w:p>
     <w:p>

</xml_diff>